<commit_message>
update user - members - opp
</commit_message>
<xml_diff>
--- a/Ke_Hoach_Trien_Khai_Du_An_Vest_Nhom_3_Nguoi.docx
+++ b/Ke_Hoach_Trien_Khai_Du_An_Vest_Nhom_3_Nguoi.docx
@@ -229,7 +229,7 @@
               <w:rPr>
                 <w:sz w:val="18"/>
               </w:rPr>
-              <w:t>Đã có CRUD Danh mục &amp; Sản phẩm; Size rời rạc</w:t>
+              <w:t>Đầy đủ CRUD Sản phẩm, Kho Size, Bộ sưu tập &amp; Flash Sale</w:t>
             </w:r>
           </w:p>
         </w:tc>
@@ -248,7 +248,7 @@
               <w:rPr>
                 <w:sz w:val="18"/>
               </w:rPr>
-              <w:t>Khoảng 40%</w:t>
+              <w:t>Hoàn thành 100%</w:t>
             </w:r>
           </w:p>
         </w:tc>
@@ -261,14 +261,13 @@
               <w:left w:w="80" w:type="dxa"/>
               <w:right w:w="80" w:type="dxa"/>
             </w:tcMar>
-            <w:shd w:val="clear" w:color="auto" w:fill="FCF3CF"/>
           </w:tcPr>
           <w:p>
             <w:r>
               <w:rPr>
                 <w:sz w:val="18"/>
               </w:rPr>
-              <w:t>Cần làm thêm</w:t>
+              <w:t>Đã hoàn tất ⭐</w:t>
             </w:r>
           </w:p>
         </w:tc>
@@ -309,7 +308,7 @@
               <w:rPr>
                 <w:sz w:val="18"/>
               </w:rPr>
-              <w:t>users, hang_thanh_viens, khach_hangs, nhan_viens, so_do, lich_hens</w:t>
+              <w:t>tai_khoans, hang_thanh_viens, khach_hangs, nhan_viens, so_do, lich_hens</w:t>
             </w:r>
           </w:p>
         </w:tc>
@@ -328,7 +327,7 @@
               <w:rPr>
                 <w:sz w:val="18"/>
               </w:rPr>
-              <w:t>Mới có Đăng nhập &amp; Đăng ký tài khoản cơ bản</w:t>
+              <w:t>Đầy đủ Dashboard khách hàng, Thẻ VIP, Số đo &amp; Đặt lịch hẹn showroom</w:t>
             </w:r>
           </w:p>
         </w:tc>
@@ -347,7 +346,7 @@
               <w:rPr>
                 <w:sz w:val="18"/>
               </w:rPr>
-              <w:t>Khoảng 20%</w:t>
+              <w:t>Hoàn thành 100%</w:t>
             </w:r>
           </w:p>
         </w:tc>
@@ -360,14 +359,13 @@
               <w:left w:w="80" w:type="dxa"/>
               <w:right w:w="80" w:type="dxa"/>
             </w:tcMar>
-            <w:shd w:val="clear" w:color="auto" w:fill="FADBD8"/>
           </w:tcPr>
           <w:p>
             <w:r>
               <w:rPr>
                 <w:sz w:val="18"/>
               </w:rPr>
-              <w:t>Làm mới nhiều</w:t>
+              <w:t>Đã hoàn tất ⭐</w:t>
             </w:r>
           </w:p>
         </w:tc>
@@ -427,7 +425,7 @@
               <w:rPr>
                 <w:sz w:val="18"/>
               </w:rPr>
-              <w:t>Giỏ hàng Session, Checkout đơn, Thống kê doanh thu</w:t>
+              <w:t>Giỏ hàng Session/DB, Checkout đơn, Thống kê doanh thu &amp; Trừ tồn kho</w:t>
             </w:r>
           </w:p>
         </w:tc>
@@ -446,7 +444,7 @@
               <w:rPr>
                 <w:sz w:val="18"/>
               </w:rPr>
-              <w:t>Khoảng 70%</w:t>
+              <w:t>Khoảng 70% - 80%</w:t>
             </w:r>
           </w:p>
         </w:tc>
@@ -459,14 +457,13 @@
               <w:left w:w="80" w:type="dxa"/>
               <w:right w:w="80" w:type="dxa"/>
             </w:tcMar>
-            <w:shd w:val="clear" w:color="auto" w:fill="D5F5E3"/>
           </w:tcPr>
           <w:p>
             <w:r>
               <w:rPr>
                 <w:sz w:val="18"/>
               </w:rPr>
-              <w:t>Nhiều nhất ⭐</w:t>
+              <w:t>Đang hoàn thiện</w:t>
             </w:r>
           </w:p>
         </w:tc>
@@ -939,9 +936,9 @@
       <w:r>
         <w:t>• Vai trò chính: Quản lý định danh tài khoản, phân tách khách hàng &amp; nhân sự, chương trình khách hàng thân thiết (Loyalty), hồ sơ số đo may đo vest và dịch vụ đặt lịch thử đồ tại cửa hàng.</w:t>
         <w:br/>
-        <w:t>• Bảng dữ liệu phụ trách (6 bảng): users, hang_thanh_viens, khach_hangs, nhan_viens, so_do_khach_hangs, lich_hens.</w:t>
+        <w:t>• Bảng dữ liệu phụ trách (6 bảng): tai_khoans, hang_thanh_viens, khach_hangs, nhan_viens, so_do_khach_hangs, lich_hens.</w:t>
         <w:br/>
-        <w:t>• Khối lượng hiện tại: Đã xong 20% (Mới có đăng nhập/đăng ký cơ bản trên users cũ).</w:t>
+        <w:t>• Khối lượng hiện tại: ĐÃ HOÀN THÀNH 100% (Hoàn thành trọn vẹn cả 4 Task: 2.1, 2.2, 2.3, 2.4 - Đã có báo cáo hoàn thiện và hướng dẫn ghép nối).</w:t>
       </w:r>
     </w:p>
     <w:tbl>

</xml_diff>